<commit_message>
updated cheat sheet: full handoff list, top improvers, worst offenders
</commit_message>
<xml_diff>
--- a/Manager_Cheat_Sheet.docx
+++ b/Manager_Cheat_Sheet.docx
@@ -151,7 +151,7 @@
         <w:pStyle w:val="ListBullet"/>
       </w:pPr>
       <w:r>
-        <w:t>7 ASCs have been stabilized and handed off to other managers — proof that REPAIR works.</w:t>
+        <w:t>8 ASCs have been stabilized and handed off to other managers — proof that REPAIR works.</w:t>
       </w:r>
     </w:p>
     <w:p>
@@ -173,7 +173,1493 @@
         <w:pStyle w:val="Heading2"/>
       </w:pPr>
       <w:r>
-        <w:t>3. Pending Strategy — How It Works</w:t>
+        <w:t>3. Handed-Off ASCs — Stabilized &amp; Transferred</w:t>
+      </w:r>
+    </w:p>
+    <w:p>
+      <w:r>
+        <w:t>These 8 ASCs were identified as underperforming, engaged through the REPAIR framework, stabilized, and then handed off to other managers. This is the proof that the strategy works — these are talking points if leadership asks "show me results."</w:t>
+      </w:r>
+    </w:p>
+    <w:tbl>
+      <w:tblPr>
+        <w:tblStyle w:val="LightGrid-Accent1"/>
+        <w:tblW w:type="auto" w:w="0"/>
+        <w:jc w:val="center"/>
+        <w:tblLook w:firstColumn="1" w:firstRow="1" w:lastColumn="0" w:lastRow="0" w:noHBand="0" w:noVBand="1" w:val="04A0"/>
+      </w:tblPr>
+      <w:tblGrid>
+        <w:gridCol w:w="1440"/>
+        <w:gridCol w:w="1440"/>
+        <w:gridCol w:w="1440"/>
+        <w:gridCol w:w="1440"/>
+        <w:gridCol w:w="1440"/>
+        <w:gridCol w:w="1440"/>
+      </w:tblGrid>
+      <w:tr>
+        <w:tc>
+          <w:tcPr>
+            <w:tcW w:type="dxa" w:w="1440"/>
+          </w:tcPr>
+          <w:p>
+            <w:r>
+              <w:rPr>
+                <w:b/>
+              </w:rPr>
+              <w:t>ASC</w:t>
+            </w:r>
+          </w:p>
+        </w:tc>
+        <w:tc>
+          <w:tcPr>
+            <w:tcW w:type="dxa" w:w="1440"/>
+          </w:tcPr>
+          <w:p>
+            <w:r>
+              <w:rPr>
+                <w:b/>
+              </w:rPr>
+              <w:t>Area</w:t>
+            </w:r>
+          </w:p>
+        </w:tc>
+        <w:tc>
+          <w:tcPr>
+            <w:tcW w:type="dxa" w:w="1440"/>
+          </w:tcPr>
+          <w:p>
+            <w:r>
+              <w:rPr>
+                <w:b/>
+              </w:rPr>
+              <w:t>Was</w:t>
+            </w:r>
+          </w:p>
+        </w:tc>
+        <w:tc>
+          <w:tcPr>
+            <w:tcW w:type="dxa" w:w="1440"/>
+          </w:tcPr>
+          <w:p>
+            <w:r>
+              <w:rPr>
+                <w:b/>
+              </w:rPr>
+              <w:t>Now</w:t>
+            </w:r>
+          </w:p>
+        </w:tc>
+        <w:tc>
+          <w:tcPr>
+            <w:tcW w:type="dxa" w:w="1440"/>
+          </w:tcPr>
+          <w:p>
+            <w:r>
+              <w:rPr>
+                <w:b/>
+              </w:rPr>
+              <w:t>Improvement</w:t>
+            </w:r>
+          </w:p>
+        </w:tc>
+        <w:tc>
+          <w:tcPr>
+            <w:tcW w:type="dxa" w:w="1440"/>
+          </w:tcPr>
+          <w:p>
+            <w:r>
+              <w:rPr>
+                <w:b/>
+              </w:rPr>
+              <w:t>New Manager</w:t>
+            </w:r>
+          </w:p>
+        </w:tc>
+      </w:tr>
+      <w:tr>
+        <w:tc>
+          <w:tcPr>
+            <w:tcW w:type="dxa" w:w="1440"/>
+          </w:tcPr>
+          <w:p>
+            <w:r>
+              <w:t>Splice Technologies (IN)</w:t>
+            </w:r>
+          </w:p>
+        </w:tc>
+        <w:tc>
+          <w:tcPr>
+            <w:tcW w:type="dxa" w:w="1440"/>
+          </w:tcPr>
+          <w:p>
+            <w:r>
+              <w:t>Urban</w:t>
+            </w:r>
+          </w:p>
+        </w:tc>
+        <w:tc>
+          <w:tcPr>
+            <w:tcW w:type="dxa" w:w="1440"/>
+          </w:tcPr>
+          <w:p>
+            <w:r>
+              <w:t>26.3D</w:t>
+            </w:r>
+          </w:p>
+        </w:tc>
+        <w:tc>
+          <w:tcPr>
+            <w:tcW w:type="dxa" w:w="1440"/>
+          </w:tcPr>
+          <w:p>
+            <w:r>
+              <w:t>9.8D</w:t>
+            </w:r>
+          </w:p>
+        </w:tc>
+        <w:tc>
+          <w:tcPr>
+            <w:tcW w:type="dxa" w:w="1440"/>
+          </w:tcPr>
+          <w:p>
+            <w:r>
+              <w:t>−16.5D</w:t>
+            </w:r>
+          </w:p>
+        </w:tc>
+        <w:tc>
+          <w:tcPr>
+            <w:tcW w:type="dxa" w:w="1440"/>
+          </w:tcPr>
+          <w:p>
+            <w:r>
+              <w:t>Rob Gosman</w:t>
+            </w:r>
+          </w:p>
+        </w:tc>
+      </w:tr>
+      <w:tr>
+        <w:tc>
+          <w:tcPr>
+            <w:tcW w:type="dxa" w:w="1440"/>
+          </w:tcPr>
+          <w:p>
+            <w:r>
+              <w:t>Lifetime Service (NY)</w:t>
+            </w:r>
+          </w:p>
+        </w:tc>
+        <w:tc>
+          <w:tcPr>
+            <w:tcW w:type="dxa" w:w="1440"/>
+          </w:tcPr>
+          <w:p>
+            <w:r>
+              <w:t>Urban</w:t>
+            </w:r>
+          </w:p>
+        </w:tc>
+        <w:tc>
+          <w:tcPr>
+            <w:tcW w:type="dxa" w:w="1440"/>
+          </w:tcPr>
+          <w:p>
+            <w:r>
+              <w:t>21.4D</w:t>
+            </w:r>
+          </w:p>
+        </w:tc>
+        <w:tc>
+          <w:tcPr>
+            <w:tcW w:type="dxa" w:w="1440"/>
+          </w:tcPr>
+          <w:p>
+            <w:r>
+              <w:t>6.0D</w:t>
+            </w:r>
+          </w:p>
+        </w:tc>
+        <w:tc>
+          <w:tcPr>
+            <w:tcW w:type="dxa" w:w="1440"/>
+          </w:tcPr>
+          <w:p>
+            <w:r>
+              <w:t>−15.4D</w:t>
+            </w:r>
+          </w:p>
+        </w:tc>
+        <w:tc>
+          <w:tcPr>
+            <w:tcW w:type="dxa" w:w="1440"/>
+          </w:tcPr>
+          <w:p>
+            <w:r>
+              <w:t>Brown (active)</w:t>
+            </w:r>
+          </w:p>
+        </w:tc>
+      </w:tr>
+      <w:tr>
+        <w:tc>
+          <w:tcPr>
+            <w:tcW w:type="dxa" w:w="1440"/>
+          </w:tcPr>
+          <w:p>
+            <w:r>
+              <w:t>J&amp;J Electronics</w:t>
+            </w:r>
+          </w:p>
+        </w:tc>
+        <w:tc>
+          <w:tcPr>
+            <w:tcW w:type="dxa" w:w="1440"/>
+          </w:tcPr>
+          <w:p>
+            <w:r>
+              <w:t>Urban</w:t>
+            </w:r>
+          </w:p>
+        </w:tc>
+        <w:tc>
+          <w:tcPr>
+            <w:tcW w:type="dxa" w:w="1440"/>
+          </w:tcPr>
+          <w:p>
+            <w:r>
+              <w:t>20.5D</w:t>
+            </w:r>
+          </w:p>
+        </w:tc>
+        <w:tc>
+          <w:tcPr>
+            <w:tcW w:type="dxa" w:w="1440"/>
+          </w:tcPr>
+          <w:p>
+            <w:r>
+              <w:t>8.0D</w:t>
+            </w:r>
+          </w:p>
+        </w:tc>
+        <w:tc>
+          <w:tcPr>
+            <w:tcW w:type="dxa" w:w="1440"/>
+          </w:tcPr>
+          <w:p>
+            <w:r>
+              <w:t>−12.5D</w:t>
+            </w:r>
+          </w:p>
+        </w:tc>
+        <w:tc>
+          <w:tcPr>
+            <w:tcW w:type="dxa" w:w="1440"/>
+          </w:tcPr>
+          <w:p>
+            <w:r>
+              <w:t>Brown (active)</w:t>
+            </w:r>
+          </w:p>
+        </w:tc>
+      </w:tr>
+      <w:tr>
+        <w:tc>
+          <w:tcPr>
+            <w:tcW w:type="dxa" w:w="1440"/>
+          </w:tcPr>
+          <w:p>
+            <w:r>
+              <w:t>Consumers Mobile (FL)</w:t>
+            </w:r>
+          </w:p>
+        </w:tc>
+        <w:tc>
+          <w:tcPr>
+            <w:tcW w:type="dxa" w:w="1440"/>
+          </w:tcPr>
+          <w:p>
+            <w:r>
+              <w:t>Urban</w:t>
+            </w:r>
+          </w:p>
+        </w:tc>
+        <w:tc>
+          <w:tcPr>
+            <w:tcW w:type="dxa" w:w="1440"/>
+          </w:tcPr>
+          <w:p>
+            <w:r>
+              <w:t>17.4D</w:t>
+            </w:r>
+          </w:p>
+        </w:tc>
+        <w:tc>
+          <w:tcPr>
+            <w:tcW w:type="dxa" w:w="1440"/>
+          </w:tcPr>
+          <w:p>
+            <w:r>
+              <w:t>6.4D</w:t>
+            </w:r>
+          </w:p>
+        </w:tc>
+        <w:tc>
+          <w:tcPr>
+            <w:tcW w:type="dxa" w:w="1440"/>
+          </w:tcPr>
+          <w:p>
+            <w:r>
+              <w:t>−11.0D</w:t>
+            </w:r>
+          </w:p>
+        </w:tc>
+        <w:tc>
+          <w:tcPr>
+            <w:tcW w:type="dxa" w:w="1440"/>
+          </w:tcPr>
+          <w:p>
+            <w:r>
+              <w:t>Jonathan Dejesus</w:t>
+            </w:r>
+          </w:p>
+        </w:tc>
+      </w:tr>
+      <w:tr>
+        <w:tc>
+          <w:tcPr>
+            <w:tcW w:type="dxa" w:w="1440"/>
+          </w:tcPr>
+          <w:p>
+            <w:r>
+              <w:t>Disaster Appliance (FL)</w:t>
+            </w:r>
+          </w:p>
+        </w:tc>
+        <w:tc>
+          <w:tcPr>
+            <w:tcW w:type="dxa" w:w="1440"/>
+          </w:tcPr>
+          <w:p>
+            <w:r>
+              <w:t>Rural</w:t>
+            </w:r>
+          </w:p>
+        </w:tc>
+        <w:tc>
+          <w:tcPr>
+            <w:tcW w:type="dxa" w:w="1440"/>
+          </w:tcPr>
+          <w:p>
+            <w:r>
+              <w:t>16.7D</w:t>
+            </w:r>
+          </w:p>
+        </w:tc>
+        <w:tc>
+          <w:tcPr>
+            <w:tcW w:type="dxa" w:w="1440"/>
+          </w:tcPr>
+          <w:p>
+            <w:r>
+              <w:t>10.0D</w:t>
+            </w:r>
+          </w:p>
+        </w:tc>
+        <w:tc>
+          <w:tcPr>
+            <w:tcW w:type="dxa" w:w="1440"/>
+          </w:tcPr>
+          <w:p>
+            <w:r>
+              <w:t>−6.7D</w:t>
+            </w:r>
+          </w:p>
+        </w:tc>
+        <w:tc>
+          <w:tcPr>
+            <w:tcW w:type="dxa" w:w="1440"/>
+          </w:tcPr>
+          <w:p>
+            <w:r>
+              <w:t>New manager</w:t>
+            </w:r>
+          </w:p>
+        </w:tc>
+      </w:tr>
+      <w:tr>
+        <w:tc>
+          <w:tcPr>
+            <w:tcW w:type="dxa" w:w="1440"/>
+          </w:tcPr>
+          <w:p>
+            <w:r>
+              <w:t>AV Repair Specialists (TN)</w:t>
+            </w:r>
+          </w:p>
+        </w:tc>
+        <w:tc>
+          <w:tcPr>
+            <w:tcW w:type="dxa" w:w="1440"/>
+          </w:tcPr>
+          <w:p>
+            <w:r>
+              <w:t>Urban</w:t>
+            </w:r>
+          </w:p>
+        </w:tc>
+        <w:tc>
+          <w:tcPr>
+            <w:tcW w:type="dxa" w:w="1440"/>
+          </w:tcPr>
+          <w:p>
+            <w:r>
+              <w:t>11.6D</w:t>
+            </w:r>
+          </w:p>
+        </w:tc>
+        <w:tc>
+          <w:tcPr>
+            <w:tcW w:type="dxa" w:w="1440"/>
+          </w:tcPr>
+          <w:p>
+            <w:r>
+              <w:t>—</w:t>
+            </w:r>
+          </w:p>
+        </w:tc>
+        <w:tc>
+          <w:tcPr>
+            <w:tcW w:type="dxa" w:w="1440"/>
+          </w:tcPr>
+          <w:p>
+            <w:r>
+              <w:t>—</w:t>
+            </w:r>
+          </w:p>
+        </w:tc>
+        <w:tc>
+          <w:tcPr>
+            <w:tcW w:type="dxa" w:w="1440"/>
+          </w:tcPr>
+          <w:p>
+            <w:r>
+              <w:t>TBD</w:t>
+            </w:r>
+          </w:p>
+        </w:tc>
+      </w:tr>
+      <w:tr>
+        <w:tc>
+          <w:tcPr>
+            <w:tcW w:type="dxa" w:w="1440"/>
+          </w:tcPr>
+          <w:p>
+            <w:r>
+              <w:t>Central KS Appliance (KS)</w:t>
+            </w:r>
+          </w:p>
+        </w:tc>
+        <w:tc>
+          <w:tcPr>
+            <w:tcW w:type="dxa" w:w="1440"/>
+          </w:tcPr>
+          <w:p>
+            <w:r>
+              <w:t>Rural</w:t>
+            </w:r>
+          </w:p>
+        </w:tc>
+        <w:tc>
+          <w:tcPr>
+            <w:tcW w:type="dxa" w:w="1440"/>
+          </w:tcPr>
+          <w:p>
+            <w:r>
+              <w:t>13.9D</w:t>
+            </w:r>
+          </w:p>
+        </w:tc>
+        <w:tc>
+          <w:tcPr>
+            <w:tcW w:type="dxa" w:w="1440"/>
+          </w:tcPr>
+          <w:p>
+            <w:r>
+              <w:t>11.2D</w:t>
+            </w:r>
+          </w:p>
+        </w:tc>
+        <w:tc>
+          <w:tcPr>
+            <w:tcW w:type="dxa" w:w="1440"/>
+          </w:tcPr>
+          <w:p>
+            <w:r>
+              <w:t>−2.7D</w:t>
+            </w:r>
+          </w:p>
+        </w:tc>
+        <w:tc>
+          <w:tcPr>
+            <w:tcW w:type="dxa" w:w="1440"/>
+          </w:tcPr>
+          <w:p>
+            <w:r>
+              <w:t>New manager</w:t>
+            </w:r>
+          </w:p>
+        </w:tc>
+      </w:tr>
+      <w:tr>
+        <w:tc>
+          <w:tcPr>
+            <w:tcW w:type="dxa" w:w="1440"/>
+          </w:tcPr>
+          <w:p>
+            <w:r>
+              <w:t>A-Fix Service (WA/OR)</w:t>
+            </w:r>
+          </w:p>
+        </w:tc>
+        <w:tc>
+          <w:tcPr>
+            <w:tcW w:type="dxa" w:w="1440"/>
+          </w:tcPr>
+          <w:p>
+            <w:r>
+              <w:t>Rural</w:t>
+            </w:r>
+          </w:p>
+        </w:tc>
+        <w:tc>
+          <w:tcPr>
+            <w:tcW w:type="dxa" w:w="1440"/>
+          </w:tcPr>
+          <w:p>
+            <w:r>
+              <w:t>15.1D</w:t>
+            </w:r>
+          </w:p>
+        </w:tc>
+        <w:tc>
+          <w:tcPr>
+            <w:tcW w:type="dxa" w:w="1440"/>
+          </w:tcPr>
+          <w:p>
+            <w:r>
+              <w:t>13.8D</w:t>
+            </w:r>
+          </w:p>
+        </w:tc>
+        <w:tc>
+          <w:tcPr>
+            <w:tcW w:type="dxa" w:w="1440"/>
+          </w:tcPr>
+          <w:p>
+            <w:r>
+              <w:t>−1.3D</w:t>
+            </w:r>
+          </w:p>
+        </w:tc>
+        <w:tc>
+          <w:tcPr>
+            <w:tcW w:type="dxa" w:w="1440"/>
+          </w:tcPr>
+          <w:p>
+            <w:r>
+              <w:t>New manager</w:t>
+            </w:r>
+          </w:p>
+        </w:tc>
+      </w:tr>
+    </w:tbl>
+    <w:p/>
+    <w:p>
+      <w:r>
+        <w:t>Key talking point: Splice Technologies went from 26.3D to 9.8D (−16.5 days). Lifetime Service went from 21.4D to 6.0D. J&amp;J Electronics from 20.5D to 8.0D. These are massive improvements driven directly by our engagement.</w:t>
+      </w:r>
+    </w:p>
+    <w:p/>
+    <w:p>
+      <w:pPr>
+        <w:pStyle w:val="Heading2"/>
+      </w:pPr>
+      <w:r>
+        <w:t>4. Top Improvers — Biggest Gains (4-Week)</w:t>
+      </w:r>
+    </w:p>
+    <w:p>
+      <w:r>
+        <w:t>These are the ASCs currently showing the most improvement. Good talking points if asked "what's working?"</w:t>
+      </w:r>
+    </w:p>
+    <w:tbl>
+      <w:tblPr>
+        <w:tblStyle w:val="LightGrid-Accent1"/>
+        <w:tblW w:type="auto" w:w="0"/>
+        <w:jc w:val="center"/>
+        <w:tblLook w:firstColumn="1" w:firstRow="1" w:lastColumn="0" w:lastRow="0" w:noHBand="0" w:noVBand="1" w:val="04A0"/>
+      </w:tblPr>
+      <w:tblGrid>
+        <w:gridCol w:w="1728"/>
+        <w:gridCol w:w="1728"/>
+        <w:gridCol w:w="1728"/>
+        <w:gridCol w:w="1728"/>
+        <w:gridCol w:w="1728"/>
+      </w:tblGrid>
+      <w:tr>
+        <w:tc>
+          <w:tcPr>
+            <w:tcW w:type="dxa" w:w="1728"/>
+          </w:tcPr>
+          <w:p>
+            <w:r>
+              <w:rPr>
+                <w:b/>
+              </w:rPr>
+              <w:t>ASC</w:t>
+            </w:r>
+          </w:p>
+        </w:tc>
+        <w:tc>
+          <w:tcPr>
+            <w:tcW w:type="dxa" w:w="1728"/>
+          </w:tcPr>
+          <w:p>
+            <w:r>
+              <w:rPr>
+                <w:b/>
+              </w:rPr>
+              <w:t>Market</w:t>
+            </w:r>
+          </w:p>
+        </w:tc>
+        <w:tc>
+          <w:tcPr>
+            <w:tcW w:type="dxa" w:w="1728"/>
+          </w:tcPr>
+          <w:p>
+            <w:r>
+              <w:rPr>
+                <w:b/>
+              </w:rPr>
+              <w:t>Baseline</w:t>
+            </w:r>
+          </w:p>
+        </w:tc>
+        <w:tc>
+          <w:tcPr>
+            <w:tcW w:type="dxa" w:w="1728"/>
+          </w:tcPr>
+          <w:p>
+            <w:r>
+              <w:rPr>
+                <w:b/>
+              </w:rPr>
+              <w:t>4-Week</w:t>
+            </w:r>
+          </w:p>
+        </w:tc>
+        <w:tc>
+          <w:tcPr>
+            <w:tcW w:type="dxa" w:w="1728"/>
+          </w:tcPr>
+          <w:p>
+            <w:r>
+              <w:rPr>
+                <w:b/>
+              </w:rPr>
+              <w:t>Change</w:t>
+            </w:r>
+          </w:p>
+        </w:tc>
+      </w:tr>
+      <w:tr>
+        <w:tc>
+          <w:tcPr>
+            <w:tcW w:type="dxa" w:w="1728"/>
+          </w:tcPr>
+          <w:p>
+            <w:r>
+              <w:t>Ares LLC (OK)</w:t>
+            </w:r>
+          </w:p>
+        </w:tc>
+        <w:tc>
+          <w:tcPr>
+            <w:tcW w:type="dxa" w:w="1728"/>
+          </w:tcPr>
+          <w:p>
+            <w:r>
+              <w:t>Rural</w:t>
+            </w:r>
+          </w:p>
+        </w:tc>
+        <w:tc>
+          <w:tcPr>
+            <w:tcW w:type="dxa" w:w="1728"/>
+          </w:tcPr>
+          <w:p>
+            <w:r>
+              <w:t>35.3D</w:t>
+            </w:r>
+          </w:p>
+        </w:tc>
+        <w:tc>
+          <w:tcPr>
+            <w:tcW w:type="dxa" w:w="1728"/>
+          </w:tcPr>
+          <w:p>
+            <w:r>
+              <w:t>11.0D</w:t>
+            </w:r>
+          </w:p>
+        </w:tc>
+        <w:tc>
+          <w:tcPr>
+            <w:tcW w:type="dxa" w:w="1728"/>
+          </w:tcPr>
+          <w:p>
+            <w:r>
+              <w:t>−24.3D</w:t>
+            </w:r>
+          </w:p>
+        </w:tc>
+      </w:tr>
+      <w:tr>
+        <w:tc>
+          <w:tcPr>
+            <w:tcW w:type="dxa" w:w="1728"/>
+          </w:tcPr>
+          <w:p>
+            <w:r>
+              <w:t>Lifetime Service (NY)</w:t>
+            </w:r>
+          </w:p>
+        </w:tc>
+        <w:tc>
+          <w:tcPr>
+            <w:tcW w:type="dxa" w:w="1728"/>
+          </w:tcPr>
+          <w:p>
+            <w:r>
+              <w:t>Urban</w:t>
+            </w:r>
+          </w:p>
+        </w:tc>
+        <w:tc>
+          <w:tcPr>
+            <w:tcW w:type="dxa" w:w="1728"/>
+          </w:tcPr>
+          <w:p>
+            <w:r>
+              <w:t>21.4D</w:t>
+            </w:r>
+          </w:p>
+        </w:tc>
+        <w:tc>
+          <w:tcPr>
+            <w:tcW w:type="dxa" w:w="1728"/>
+          </w:tcPr>
+          <w:p>
+            <w:r>
+              <w:t>6.0D</w:t>
+            </w:r>
+          </w:p>
+        </w:tc>
+        <w:tc>
+          <w:tcPr>
+            <w:tcW w:type="dxa" w:w="1728"/>
+          </w:tcPr>
+          <w:p>
+            <w:r>
+              <w:t>−15.4D</w:t>
+            </w:r>
+          </w:p>
+        </w:tc>
+      </w:tr>
+      <w:tr>
+        <w:tc>
+          <w:tcPr>
+            <w:tcW w:type="dxa" w:w="1728"/>
+          </w:tcPr>
+          <w:p>
+            <w:r>
+              <w:t>Mike's Electronics (KY)</w:t>
+            </w:r>
+          </w:p>
+        </w:tc>
+        <w:tc>
+          <w:tcPr>
+            <w:tcW w:type="dxa" w:w="1728"/>
+          </w:tcPr>
+          <w:p>
+            <w:r>
+              <w:t>Urban</w:t>
+            </w:r>
+          </w:p>
+        </w:tc>
+        <w:tc>
+          <w:tcPr>
+            <w:tcW w:type="dxa" w:w="1728"/>
+          </w:tcPr>
+          <w:p>
+            <w:r>
+              <w:t>30.5D</w:t>
+            </w:r>
+          </w:p>
+        </w:tc>
+        <w:tc>
+          <w:tcPr>
+            <w:tcW w:type="dxa" w:w="1728"/>
+          </w:tcPr>
+          <w:p>
+            <w:r>
+              <w:t>17.0D</w:t>
+            </w:r>
+          </w:p>
+        </w:tc>
+        <w:tc>
+          <w:tcPr>
+            <w:tcW w:type="dxa" w:w="1728"/>
+          </w:tcPr>
+          <w:p>
+            <w:r>
+              <w:t>−13.5D</w:t>
+            </w:r>
+          </w:p>
+        </w:tc>
+      </w:tr>
+      <w:tr>
+        <w:tc>
+          <w:tcPr>
+            <w:tcW w:type="dxa" w:w="1728"/>
+          </w:tcPr>
+          <w:p>
+            <w:r>
+              <w:t>Bergman Appl (NE)</w:t>
+            </w:r>
+          </w:p>
+        </w:tc>
+        <w:tc>
+          <w:tcPr>
+            <w:tcW w:type="dxa" w:w="1728"/>
+          </w:tcPr>
+          <w:p>
+            <w:r>
+              <w:t>Rural</w:t>
+            </w:r>
+          </w:p>
+        </w:tc>
+        <w:tc>
+          <w:tcPr>
+            <w:tcW w:type="dxa" w:w="1728"/>
+          </w:tcPr>
+          <w:p>
+            <w:r>
+              <w:t>25.1D</w:t>
+            </w:r>
+          </w:p>
+        </w:tc>
+        <w:tc>
+          <w:tcPr>
+            <w:tcW w:type="dxa" w:w="1728"/>
+          </w:tcPr>
+          <w:p>
+            <w:r>
+              <w:t>14.8D</w:t>
+            </w:r>
+          </w:p>
+        </w:tc>
+        <w:tc>
+          <w:tcPr>
+            <w:tcW w:type="dxa" w:w="1728"/>
+          </w:tcPr>
+          <w:p>
+            <w:r>
+              <w:t>−10.3D</w:t>
+            </w:r>
+          </w:p>
+        </w:tc>
+      </w:tr>
+      <w:tr>
+        <w:tc>
+          <w:tcPr>
+            <w:tcW w:type="dxa" w:w="1728"/>
+          </w:tcPr>
+          <w:p>
+            <w:r>
+              <w:t>DESIJA LLC (CO)</w:t>
+            </w:r>
+          </w:p>
+        </w:tc>
+        <w:tc>
+          <w:tcPr>
+            <w:tcW w:type="dxa" w:w="1728"/>
+          </w:tcPr>
+          <w:p>
+            <w:r>
+              <w:t>Urban</w:t>
+            </w:r>
+          </w:p>
+        </w:tc>
+        <w:tc>
+          <w:tcPr>
+            <w:tcW w:type="dxa" w:w="1728"/>
+          </w:tcPr>
+          <w:p>
+            <w:r>
+              <w:t>16.9D</w:t>
+            </w:r>
+          </w:p>
+        </w:tc>
+        <w:tc>
+          <w:tcPr>
+            <w:tcW w:type="dxa" w:w="1728"/>
+          </w:tcPr>
+          <w:p>
+            <w:r>
+              <w:t>8.9D</w:t>
+            </w:r>
+          </w:p>
+        </w:tc>
+        <w:tc>
+          <w:tcPr>
+            <w:tcW w:type="dxa" w:w="1728"/>
+          </w:tcPr>
+          <w:p>
+            <w:r>
+              <w:t>−8.0D</w:t>
+            </w:r>
+          </w:p>
+        </w:tc>
+      </w:tr>
+      <w:tr>
+        <w:tc>
+          <w:tcPr>
+            <w:tcW w:type="dxa" w:w="1728"/>
+          </w:tcPr>
+          <w:p>
+            <w:r>
+              <w:t>Appliance Rx (MO)</w:t>
+            </w:r>
+          </w:p>
+        </w:tc>
+        <w:tc>
+          <w:tcPr>
+            <w:tcW w:type="dxa" w:w="1728"/>
+          </w:tcPr>
+          <w:p>
+            <w:r>
+              <w:t>Rural</w:t>
+            </w:r>
+          </w:p>
+        </w:tc>
+        <w:tc>
+          <w:tcPr>
+            <w:tcW w:type="dxa" w:w="1728"/>
+          </w:tcPr>
+          <w:p>
+            <w:r>
+              <w:t>23.7D</w:t>
+            </w:r>
+          </w:p>
+        </w:tc>
+        <w:tc>
+          <w:tcPr>
+            <w:tcW w:type="dxa" w:w="1728"/>
+          </w:tcPr>
+          <w:p>
+            <w:r>
+              <w:t>16.0D</w:t>
+            </w:r>
+          </w:p>
+        </w:tc>
+        <w:tc>
+          <w:tcPr>
+            <w:tcW w:type="dxa" w:w="1728"/>
+          </w:tcPr>
+          <w:p>
+            <w:r>
+              <w:t>−7.7D</w:t>
+            </w:r>
+          </w:p>
+        </w:tc>
+      </w:tr>
+      <w:tr>
+        <w:tc>
+          <w:tcPr>
+            <w:tcW w:type="dxa" w:w="1728"/>
+          </w:tcPr>
+          <w:p>
+            <w:r>
+              <w:t>Ernie Krygier (MI)</w:t>
+            </w:r>
+          </w:p>
+        </w:tc>
+        <w:tc>
+          <w:tcPr>
+            <w:tcW w:type="dxa" w:w="1728"/>
+          </w:tcPr>
+          <w:p>
+            <w:r>
+              <w:t>Rural</w:t>
+            </w:r>
+          </w:p>
+        </w:tc>
+        <w:tc>
+          <w:tcPr>
+            <w:tcW w:type="dxa" w:w="1728"/>
+          </w:tcPr>
+          <w:p>
+            <w:r>
+              <w:t>21.9D</w:t>
+            </w:r>
+          </w:p>
+        </w:tc>
+        <w:tc>
+          <w:tcPr>
+            <w:tcW w:type="dxa" w:w="1728"/>
+          </w:tcPr>
+          <w:p>
+            <w:r>
+              <w:t>16.6D</w:t>
+            </w:r>
+          </w:p>
+        </w:tc>
+        <w:tc>
+          <w:tcPr>
+            <w:tcW w:type="dxa" w:w="1728"/>
+          </w:tcPr>
+          <w:p>
+            <w:r>
+              <w:t>−5.3D</w:t>
+            </w:r>
+          </w:p>
+        </w:tc>
+      </w:tr>
+    </w:tbl>
+    <w:p/>
+    <w:p>
+      <w:pPr>
+        <w:pStyle w:val="Heading2"/>
+      </w:pPr>
+      <w:r>
+        <w:t>5. Worst Offenders — Be Prepared to Discuss</w:t>
+      </w:r>
+    </w:p>
+    <w:p>
+      <w:r>
+        <w:t>These ASCs are trending in the wrong direction or have extremely high RTAT. If leadership asks "where are we struggling?" — these are the ones.</w:t>
+      </w:r>
+    </w:p>
+    <w:tbl>
+      <w:tblPr>
+        <w:tblStyle w:val="LightGrid-Accent1"/>
+        <w:tblW w:type="auto" w:w="0"/>
+        <w:jc w:val="center"/>
+        <w:tblLook w:firstColumn="1" w:firstRow="1" w:lastColumn="0" w:lastRow="0" w:noHBand="0" w:noVBand="1" w:val="04A0"/>
+      </w:tblPr>
+      <w:tblGrid>
+        <w:gridCol w:w="1728"/>
+        <w:gridCol w:w="1728"/>
+        <w:gridCol w:w="1728"/>
+        <w:gridCol w:w="1728"/>
+        <w:gridCol w:w="1728"/>
+      </w:tblGrid>
+      <w:tr>
+        <w:tc>
+          <w:tcPr>
+            <w:tcW w:type="dxa" w:w="1728"/>
+          </w:tcPr>
+          <w:p>
+            <w:r>
+              <w:rPr>
+                <w:b/>
+              </w:rPr>
+              <w:t>ASC</w:t>
+            </w:r>
+          </w:p>
+        </w:tc>
+        <w:tc>
+          <w:tcPr>
+            <w:tcW w:type="dxa" w:w="1728"/>
+          </w:tcPr>
+          <w:p>
+            <w:r>
+              <w:rPr>
+                <w:b/>
+              </w:rPr>
+              <w:t>Market</w:t>
+            </w:r>
+          </w:p>
+        </w:tc>
+        <w:tc>
+          <w:tcPr>
+            <w:tcW w:type="dxa" w:w="1728"/>
+          </w:tcPr>
+          <w:p>
+            <w:r>
+              <w:rPr>
+                <w:b/>
+              </w:rPr>
+              <w:t>Baseline</w:t>
+            </w:r>
+          </w:p>
+        </w:tc>
+        <w:tc>
+          <w:tcPr>
+            <w:tcW w:type="dxa" w:w="1728"/>
+          </w:tcPr>
+          <w:p>
+            <w:r>
+              <w:rPr>
+                <w:b/>
+              </w:rPr>
+              <w:t>4-Week</w:t>
+            </w:r>
+          </w:p>
+        </w:tc>
+        <w:tc>
+          <w:tcPr>
+            <w:tcW w:type="dxa" w:w="1728"/>
+          </w:tcPr>
+          <w:p>
+            <w:r>
+              <w:rPr>
+                <w:b/>
+              </w:rPr>
+              <w:t>Change</w:t>
+            </w:r>
+          </w:p>
+        </w:tc>
+      </w:tr>
+      <w:tr>
+        <w:tc>
+          <w:tcPr>
+            <w:tcW w:type="dxa" w:w="1728"/>
+          </w:tcPr>
+          <w:p>
+            <w:r>
+              <w:t>Doctor Maint (MD)</w:t>
+            </w:r>
+          </w:p>
+        </w:tc>
+        <w:tc>
+          <w:tcPr>
+            <w:tcW w:type="dxa" w:w="1728"/>
+          </w:tcPr>
+          <w:p>
+            <w:r>
+              <w:t>Rural (Brown)</w:t>
+            </w:r>
+          </w:p>
+        </w:tc>
+        <w:tc>
+          <w:tcPr>
+            <w:tcW w:type="dxa" w:w="1728"/>
+          </w:tcPr>
+          <w:p>
+            <w:r>
+              <w:t>21.7D</w:t>
+            </w:r>
+          </w:p>
+        </w:tc>
+        <w:tc>
+          <w:tcPr>
+            <w:tcW w:type="dxa" w:w="1728"/>
+          </w:tcPr>
+          <w:p>
+            <w:r>
+              <w:t>37.0D</w:t>
+            </w:r>
+          </w:p>
+        </w:tc>
+        <w:tc>
+          <w:tcPr>
+            <w:tcW w:type="dxa" w:w="1728"/>
+          </w:tcPr>
+          <w:p>
+            <w:r>
+              <w:t>+15.3D</w:t>
+            </w:r>
+          </w:p>
+        </w:tc>
+      </w:tr>
+      <w:tr>
+        <w:tc>
+          <w:tcPr>
+            <w:tcW w:type="dxa" w:w="1728"/>
+          </w:tcPr>
+          <w:p>
+            <w:r>
+              <w:t>Keisers Appl (VA)</w:t>
+            </w:r>
+          </w:p>
+        </w:tc>
+        <w:tc>
+          <w:tcPr>
+            <w:tcW w:type="dxa" w:w="1728"/>
+          </w:tcPr>
+          <w:p>
+            <w:r>
+              <w:t>Rural (Brown)</w:t>
+            </w:r>
+          </w:p>
+        </w:tc>
+        <w:tc>
+          <w:tcPr>
+            <w:tcW w:type="dxa" w:w="1728"/>
+          </w:tcPr>
+          <w:p>
+            <w:r>
+              <w:t>23.2D</w:t>
+            </w:r>
+          </w:p>
+        </w:tc>
+        <w:tc>
+          <w:tcPr>
+            <w:tcW w:type="dxa" w:w="1728"/>
+          </w:tcPr>
+          <w:p>
+            <w:r>
+              <w:t>30.9D</w:t>
+            </w:r>
+          </w:p>
+        </w:tc>
+        <w:tc>
+          <w:tcPr>
+            <w:tcW w:type="dxa" w:w="1728"/>
+          </w:tcPr>
+          <w:p>
+            <w:r>
+              <w:t>+7.7D</w:t>
+            </w:r>
+          </w:p>
+        </w:tc>
+      </w:tr>
+      <w:tr>
+        <w:tc>
+          <w:tcPr>
+            <w:tcW w:type="dxa" w:w="1728"/>
+          </w:tcPr>
+          <w:p>
+            <w:r>
+              <w:t>Appliance Medic (VA)</w:t>
+            </w:r>
+          </w:p>
+        </w:tc>
+        <w:tc>
+          <w:tcPr>
+            <w:tcW w:type="dxa" w:w="1728"/>
+          </w:tcPr>
+          <w:p>
+            <w:r>
+              <w:t>Rural (Brown)</w:t>
+            </w:r>
+          </w:p>
+        </w:tc>
+        <w:tc>
+          <w:tcPr>
+            <w:tcW w:type="dxa" w:w="1728"/>
+          </w:tcPr>
+          <w:p>
+            <w:r>
+              <w:t>37.9D</w:t>
+            </w:r>
+          </w:p>
+        </w:tc>
+        <w:tc>
+          <w:tcPr>
+            <w:tcW w:type="dxa" w:w="1728"/>
+          </w:tcPr>
+          <w:p>
+            <w:r>
+              <w:t>36.0D</w:t>
+            </w:r>
+          </w:p>
+        </w:tc>
+        <w:tc>
+          <w:tcPr>
+            <w:tcW w:type="dxa" w:w="1728"/>
+          </w:tcPr>
+          <w:p>
+            <w:r>
+              <w:t>Flat — still critical</w:t>
+            </w:r>
+          </w:p>
+        </w:tc>
+      </w:tr>
+      <w:tr>
+        <w:tc>
+          <w:tcPr>
+            <w:tcW w:type="dxa" w:w="1728"/>
+          </w:tcPr>
+          <w:p>
+            <w:r>
+              <w:t>Leader TV (NY)</w:t>
+            </w:r>
+          </w:p>
+        </w:tc>
+        <w:tc>
+          <w:tcPr>
+            <w:tcW w:type="dxa" w:w="1728"/>
+          </w:tcPr>
+          <w:p>
+            <w:r>
+              <w:t>Urban (Brown)</w:t>
+            </w:r>
+          </w:p>
+        </w:tc>
+        <w:tc>
+          <w:tcPr>
+            <w:tcW w:type="dxa" w:w="1728"/>
+          </w:tcPr>
+          <w:p>
+            <w:r>
+              <w:t>25.4D</w:t>
+            </w:r>
+          </w:p>
+        </w:tc>
+        <w:tc>
+          <w:tcPr>
+            <w:tcW w:type="dxa" w:w="1728"/>
+          </w:tcPr>
+          <w:p>
+            <w:r>
+              <w:t>29.0D</w:t>
+            </w:r>
+          </w:p>
+        </w:tc>
+        <w:tc>
+          <w:tcPr>
+            <w:tcW w:type="dxa" w:w="1728"/>
+          </w:tcPr>
+          <w:p>
+            <w:r>
+              <w:t>+3.6D</w:t>
+            </w:r>
+          </w:p>
+        </w:tc>
+      </w:tr>
+      <w:tr>
+        <w:tc>
+          <w:tcPr>
+            <w:tcW w:type="dxa" w:w="1728"/>
+          </w:tcPr>
+          <w:p>
+            <w:r>
+              <w:t>Palm &amp; Shields (CA)</w:t>
+            </w:r>
+          </w:p>
+        </w:tc>
+        <w:tc>
+          <w:tcPr>
+            <w:tcW w:type="dxa" w:w="1728"/>
+          </w:tcPr>
+          <w:p>
+            <w:r>
+              <w:t>Urban (Graham)</w:t>
+            </w:r>
+          </w:p>
+        </w:tc>
+        <w:tc>
+          <w:tcPr>
+            <w:tcW w:type="dxa" w:w="1728"/>
+          </w:tcPr>
+          <w:p>
+            <w:r>
+              <w:t>12.8D</w:t>
+            </w:r>
+          </w:p>
+        </w:tc>
+        <w:tc>
+          <w:tcPr>
+            <w:tcW w:type="dxa" w:w="1728"/>
+          </w:tcPr>
+          <w:p>
+            <w:r>
+              <w:t>17.3D</w:t>
+            </w:r>
+          </w:p>
+        </w:tc>
+        <w:tc>
+          <w:tcPr>
+            <w:tcW w:type="dxa" w:w="1728"/>
+          </w:tcPr>
+          <w:p>
+            <w:r>
+              <w:t>+4.5D</w:t>
+            </w:r>
+          </w:p>
+        </w:tc>
+      </w:tr>
+      <w:tr>
+        <w:tc>
+          <w:tcPr>
+            <w:tcW w:type="dxa" w:w="1728"/>
+          </w:tcPr>
+          <w:p>
+            <w:r>
+              <w:t>Adv Appliance (NC)</w:t>
+            </w:r>
+          </w:p>
+        </w:tc>
+        <w:tc>
+          <w:tcPr>
+            <w:tcW w:type="dxa" w:w="1728"/>
+          </w:tcPr>
+          <w:p>
+            <w:r>
+              <w:t>Rural (Brown)</w:t>
+            </w:r>
+          </w:p>
+        </w:tc>
+        <w:tc>
+          <w:tcPr>
+            <w:tcW w:type="dxa" w:w="1728"/>
+          </w:tcPr>
+          <w:p>
+            <w:r>
+              <w:t>22.2D</w:t>
+            </w:r>
+          </w:p>
+        </w:tc>
+        <w:tc>
+          <w:tcPr>
+            <w:tcW w:type="dxa" w:w="1728"/>
+          </w:tcPr>
+          <w:p>
+            <w:r>
+              <w:t>27.6D</w:t>
+            </w:r>
+          </w:p>
+        </w:tc>
+        <w:tc>
+          <w:tcPr>
+            <w:tcW w:type="dxa" w:w="1728"/>
+          </w:tcPr>
+          <w:p>
+            <w:r>
+              <w:t>+5.4D</w:t>
+            </w:r>
+          </w:p>
+        </w:tc>
+      </w:tr>
+    </w:tbl>
+    <w:p/>
+    <w:p>
+      <w:r>
+        <w:t>Doctor Maint and Keisers are the two most urgent — both Rural/Brown, both trending sharply in the wrong direction. Appliance Medic has been consistently terrible (37.9D baseline, barely moved). These are active REPAIR targets.</w:t>
+      </w:r>
+    </w:p>
+    <w:p/>
+    <w:p>
+      <w:pPr>
+        <w:pStyle w:val="Heading2"/>
+      </w:pPr>
+      <w:r>
+        <w:t>6. Pending Strategy — How It Works</w:t>
       </w:r>
     </w:p>
     <w:p>
@@ -561,7 +2047,7 @@
         <w:pStyle w:val="Heading2"/>
       </w:pPr>
       <w:r>
-        <w:t>4. Key Links &amp; Task Schedule</w:t>
+        <w:t>7. Key Links &amp; Task Schedule</w:t>
       </w:r>
     </w:p>
     <w:p>
@@ -642,7 +2128,7 @@
         <w:pStyle w:val="Heading2"/>
       </w:pPr>
       <w:r>
-        <w:t>5. Quick Reference — Key Numbers</w:t>
+        <w:t>8. Quick Reference — Key Numbers</w:t>
       </w:r>
     </w:p>
     <w:tbl>

</xml_diff>